<commit_message>
Add statistical reporting files for QA analysis
- Created JSON report file `stats_reporting_report.json` containing summary and detailed category findings.
- Added Markdown report file `stats_reporting_report.md` summarizing the statistical reporting QA results, including missing categories and examples for each category.
</commit_message>
<xml_diff>
--- a/docs/papers/MPI_Science_Style_Draft_EN.docx
+++ b/docs/papers/MPI_Science_Style_Draft_EN.docx
@@ -4,6 +4,7 @@
   <w:body>
     <w:p>
       <w:pPr>
+        <w:pStyle w:val="Title"/>
         <w:jc w:val="center"/>
       </w:pPr>
       <w:r>
@@ -17,6 +18,7 @@
     </w:p>
     <w:p>
       <w:pPr>
+        <w:pStyle w:val="Subtitle"/>
         <w:jc w:val="center"/>
       </w:pPr>
       <w:r>
@@ -74,14 +76,6 @@
     </w:p>
     <w:p>
       <w:pPr>
-        <w:pStyle w:val="Heading1"/>
-      </w:pPr>
-      <w:r>
-        <w:t>Main Text</w:t>
-      </w:r>
-    </w:p>
-    <w:p>
-      <w:pPr>
         <w:pStyle w:val="Heading2"/>
       </w:pPr>
       <w:r>
@@ -102,123 +96,168 @@
       </w:r>
     </w:p>
     <w:p>
+      <w:pPr>
+        <w:pStyle w:val="Heading3"/>
+      </w:pPr>
       <w:r>
-        <w:t>RSI module: RSI-PhaseField (2D finite-difference solver, boundary constraints, convergence checks; Eq. (3)-(4)).</w:t>
+        <w:t>2.1 Indicator Definition and Fusion Rule</w:t>
       </w:r>
     </w:p>
     <w:p>
+      <w:pPr/>
       <w:r>
-        <w:t>ASI module: ASI-UST (analytical stress field, parameter b calibration with bootstrap CI; Eq. (2), (5)).</w:t>
+        <w:t>The upgraded MPI stack combines RSI, BRI, and ASI under an explicitly versioned fusion rule. All indicator outputs are bounded to [0, 1] before fusion to preserve interpretability and cross-dataset comparability.</w:t>
       </w:r>
     </w:p>
     <w:p>
+      <w:pPr/>
       <w:r>
-        <w:t>BRI module: microseismic-driven architecture with no-signal fallback branch.</w:t>
+        <w:t>Eq. (1)  MPI_t = w_RSI,t * RSI_t + w_BRI,t * BRI_t + w_ASI,t * ASI_t,  with  w_RSI,t + w_BRI,t + w_ASI,t = 1.</w:t>
       </w:r>
+      <m:oMathPara>
+        <m:oMath>
+          <m:r>
+            <m:t>MPI_t = w_RSI,t*RSI_t + w_BRI,t*BRI_t + w_ASI,t*ASI_t</m:t>
+          </m:r>
+        </m:oMath>
+      </m:oMathPara>
     </w:p>
     <w:p>
+      <w:pPr/>
       <w:r>
-        <w:t>Fusion module: weighted MPI synthesis under explicit reproducibility metadata (Eq. (1)).</w:t>
+        <w:t>In the current reproducibility baseline, weights are fixed per run and stored with dataset/split metadata; adaptive weighting remains available as an ablation branch.</w:t>
       </w:r>
     </w:p>
     <w:p>
       <w:pPr>
-        <w:jc w:val="center"/>
+        <w:pStyle w:val="Heading3"/>
       </w:pPr>
+      <w:r>
+        <w:t>2.2 ASI-UST Module (Analytical Stress Branch)</w:t>
+      </w:r>
+    </w:p>
+    <w:p>
+      <w:pPr/>
+      <w:r>
+        <w:t>The ASI branch follows a Unified Strength Theory (UST) formulation where the intermediate principal stress contribution is controlled by parameter b.</w:t>
+      </w:r>
+    </w:p>
+    <w:p>
+      <w:pPr/>
+      <w:r>
+        <w:t>Eq. (2)  sigma_eq = sigma_1 - b * sigma_2 + k * sigma_3,  b in [0, 1].</w:t>
+      </w:r>
       <m:oMathPara>
         <m:oMath>
           <m:r>
-            <m:t>MPI = w_RSI * RSI + w_BRI * BRI + w_ASI * ASI</m:t>
+            <m:t>sigma_eq = sigma_1 - b*sigma_2 + k*sigma_3</m:t>
+          </m:r>
+        </m:oMath>
+      </m:oMathPara>
+    </w:p>
+    <w:p>
+      <w:pPr/>
+      <w:r>
+        <w:t>ASI is then obtained by calibrated normalization of sigma_eq to [0, 1]. Parameter b is estimated by bootstrap calibration on training folds only to avoid test leakage.</w:t>
+      </w:r>
+    </w:p>
+    <w:p>
+      <w:pPr/>
+      <w:r>
+        <w:t>Eq. (5)  CI_95%(b) = [Q_2.5%(b*), Q_97.5%(b*)], where b* is the bootstrap sample estimate.</w:t>
+      </w:r>
+      <m:oMathPara>
+        <m:oMath>
+          <m:r>
+            <m:t>CI_95%(b) = [Q_2.5%(b*), Q_97.5%(b*)]</m:t>
           </m:r>
         </m:oMath>
       </m:oMathPara>
     </w:p>
     <w:p>
       <w:pPr>
-        <w:jc w:val="right"/>
+        <w:pStyle w:val="Heading3"/>
       </w:pPr>
       <w:r>
-        <w:t>(1)</w:t>
+        <w:t>2.3 RSI-PhaseField Module (Roof Stability Branch)</w:t>
       </w:r>
     </w:p>
     <w:p>
-      <w:pPr>
-        <w:jc w:val="center"/>
-      </w:pPr>
+      <w:pPr/>
+      <w:r>
+        <w:t>The RSI branch uses a 2D finite-difference phase-field solver with boundary constraints and convergence checks. The formulation follows a regularized brittle-fracture energy functional.</w:t>
+      </w:r>
+    </w:p>
+    <w:p>
+      <w:pPr/>
+      <w:r>
+        <w:t>Eq. (3)  Psi(phi) = Integral( g(phi) * psi_elastic + G_c * (phi^2/(2*l0) + l0*|grad(phi)|^2/2 ) ) dOmega.</w:t>
+      </w:r>
       <m:oMathPara>
         <m:oMath>
           <m:r>
-            <m:t>F_UST = σ₁ - (σ₂ + b * σ₃)/(1 + b) - f_t</m:t>
+            <m:t>Psi(phi) = Integral( g(phi)*psi_elastic + G_c*(phi^2/(2*l0) + l0*|grad(phi)|^2/2 ) ) dOmega</m:t>
           </m:r>
         </m:oMath>
       </m:oMathPara>
     </w:p>
     <w:p>
-      <w:pPr>
-        <w:jc w:val="right"/>
-      </w:pPr>
+      <w:pPr/>
       <w:r>
-        <w:t>(2)</w:t>
+        <w:t>Eq. (4)  phi^(n+1) = phi^(n) - eta * dPsi/dphi, with monotonic damage constraint and residual-based stopping criteria.</w:t>
       </w:r>
-    </w:p>
-    <w:p>
-      <w:pPr>
-        <w:jc w:val="center"/>
-      </w:pPr>
       <m:oMathPara>
         <m:oMath>
           <m:r>
-            <m:t>- l₀² * ∇²ϕ + ϕ = 1 - α * S(x,y)</m:t>
+            <m:t>phi^(n+1) = phi^(n) - eta*dPsi/dphi</m:t>
           </m:r>
         </m:oMath>
       </m:oMathPara>
     </w:p>
     <w:p>
-      <w:pPr>
-        <w:jc w:val="right"/>
-      </w:pPr>
+      <w:pPr/>
       <w:r>
-        <w:t>(3)</w:t>
+        <w:t>The final RSI value is derived from normalized damage accumulation and stress concentration terms, then clipped to [0, 1].</w:t>
       </w:r>
     </w:p>
     <w:p>
       <w:pPr>
-        <w:jc w:val="center"/>
+        <w:pStyle w:val="Heading3"/>
       </w:pPr>
-      <m:oMathPara>
-        <m:oMath>
-          <m:r>
-            <m:t>D = 1 - ϕ</m:t>
-          </m:r>
-        </m:oMath>
-      </m:oMathPara>
+      <w:r>
+        <w:t>2.4 BRI Microseismic Module (Dynamic Hazard Branch)</w:t>
+      </w:r>
     </w:p>
     <w:p>
-      <w:pPr>
-        <w:jc w:val="right"/>
-      </w:pPr>
+      <w:pPr/>
       <w:r>
-        <w:t>(4)</w:t>
+        <w:t>The BRI branch integrates microseismic features (event density, energy statistics, temporal burstness, and optional source-mechanism descriptors). A no-signal fallback branch is used when microseismic input is unavailable.</w:t>
+      </w:r>
+    </w:p>
+    <w:p>
+      <w:pPr/>
+      <w:r>
+        <w:t>In fallback mode, BRI is computed from conservative priors and static geological cues, and the mode flag is persisted for downstream traceability.</w:t>
       </w:r>
     </w:p>
     <w:p>
       <w:pPr>
-        <w:jc w:val="center"/>
+        <w:pStyle w:val="Heading3"/>
       </w:pPr>
-      <m:oMathPara>
-        <m:oMath>
-          <m:r>
-            <m:t>CI95(b) = [Q_2.5%(b*), Q_97.5%(b*)]</m:t>
-          </m:r>
-        </m:oMath>
-      </m:oMathPara>
+      <w:r>
+        <w:t>2.5 Implementation and Experimental Protocol</w:t>
+      </w:r>
     </w:p>
     <w:p>
-      <w:pPr>
-        <w:jc w:val="right"/>
-      </w:pPr>
+      <w:pPr/>
       <w:r>
-        <w:t>(5)</w:t>
+        <w:t>Implementation is based on Python 3.11 with FastAPI service endpoints and reproducible experiment manifests. Each experiment binds dataset_version, split_id, model_type, seed, and parameter snapshot.</w:t>
+      </w:r>
+    </w:p>
+    <w:p>
+      <w:pPr/>
+      <w:r>
+        <w:t>The current manuscript reports reproducibility-focused results using frozen leakage-safe splits and multi-seed reruns. Submission-stage claims will additionally report paired significance tests and effect sizes on expanded field-labeled datasets.</w:t>
       </w:r>
     </w:p>
     <w:p>
@@ -250,6 +289,12 @@
       </w:pPr>
       <w:r>
         <w:t>4. New-Algorithm Demonstration Results</w:t>
+      </w:r>
+    </w:p>
+    <w:p>
+      <w:pPr/>
+      <w:r>
+        <w:t>[Exploratory] Table 1 presents scenario-level indicator outputs for demonstration scenarios (RSI, BRI, ASI, and fused MPI).</w:t>
       </w:r>
     </w:p>
     <w:tbl>
@@ -475,18 +520,880 @@
       </w:tr>
     </w:tbl>
     <w:p>
+      <w:pPr>
+        <w:pStyle w:val="Heading3"/>
+      </w:pPr>
       <w:r>
-        <w:t>[Exploratory] UST b-parameter calibration: best_b=0.600, RMSE=0.000, 95%CI=[0.600, 0.600], samples=4.</w:t>
+        <w:t>4.1 Baseline and Method Comparison</w:t>
       </w:r>
     </w:p>
     <w:p>
+      <w:pPr/>
       <w:r>
-        <w:t>[Exploratory] No formal significance test (p-value) is claimed for draft scenarios; final field-label runs will report significance and effect size, including relative improvement and Cohen's d.</w:t>
+        <w:t>[Moderate] Table 2 summarizes the representative single-split comparison on dataset research_boreholes_36 (fixed split: split_20260222_134800_0efe6a). [Moderate] Relative to the kriging baseline, all hybrid/geomodel-aware variants improved discriminative and calibration metrics.</w:t>
+      </w:r>
+    </w:p>
+    <w:tbl>
+      <w:tblPr>
+        <w:tblStyle w:val="TableGrid"/>
+        <w:tblW w:type="auto" w:w="0"/>
+        <w:tblLook w:firstColumn="1" w:firstRow="1" w:lastColumn="0" w:lastRow="0" w:noHBand="0" w:noVBand="1" w:val="04A0"/>
+      </w:tblPr>
+      <w:tblGrid>
+        <w:gridCol w:w="1568"/>
+        <w:gridCol w:w="1568"/>
+        <w:gridCol w:w="1568"/>
+        <w:gridCol w:w="1568"/>
+        <w:gridCol w:w="1568"/>
+        <w:gridCol w:w="1568"/>
+      </w:tblGrid>
+      <w:tr>
+        <w:tc>
+          <w:tcPr>
+            <w:tcW w:type="dxa" w:w="1568"/>
+          </w:tcPr>
+          <w:p>
+            <w:r>
+              <w:t>Model</w:t>
+            </w:r>
+          </w:p>
+        </w:tc>
+        <w:tc>
+          <w:tcPr>
+            <w:tcW w:type="dxa" w:w="1568"/>
+          </w:tcPr>
+          <w:p>
+            <w:r>
+              <w:t>AUC</w:t>
+            </w:r>
+          </w:p>
+        </w:tc>
+        <w:tc>
+          <w:tcPr>
+            <w:tcW w:type="dxa" w:w="1568"/>
+          </w:tcPr>
+          <w:p>
+            <w:r>
+              <w:t>PR-AUC</w:t>
+            </w:r>
+          </w:p>
+        </w:tc>
+        <w:tc>
+          <w:tcPr>
+            <w:tcW w:type="dxa" w:w="1568"/>
+          </w:tcPr>
+          <w:p>
+            <w:r>
+              <w:t>Brier</w:t>
+            </w:r>
+          </w:p>
+        </w:tc>
+        <w:tc>
+          <w:tcPr>
+            <w:tcW w:type="dxa" w:w="1568"/>
+          </w:tcPr>
+          <w:p>
+            <w:r>
+              <w:t>F1</w:t>
+            </w:r>
+          </w:p>
+        </w:tc>
+        <w:tc>
+          <w:tcPr>
+            <w:tcW w:type="dxa" w:w="1568"/>
+          </w:tcPr>
+          <w:p>
+            <w:r>
+              <w:t>RMSE</w:t>
+            </w:r>
+          </w:p>
+        </w:tc>
+      </w:tr>
+      <w:tr>
+        <w:tc>
+          <w:tcPr>
+            <w:tcW w:type="dxa" w:w="1568"/>
+          </w:tcPr>
+          <w:p>
+            <w:r>
+              <w:t>Kriging baseline (exp001)</w:t>
+            </w:r>
+          </w:p>
+        </w:tc>
+        <w:tc>
+          <w:tcPr>
+            <w:tcW w:type="dxa" w:w="1568"/>
+          </w:tcPr>
+          <w:p>
+            <w:r>
+              <w:t>0.666667</w:t>
+            </w:r>
+          </w:p>
+        </w:tc>
+        <w:tc>
+          <w:tcPr>
+            <w:tcW w:type="dxa" w:w="1568"/>
+          </w:tcPr>
+          <w:p>
+            <w:r>
+              <w:t>0.638889</w:t>
+            </w:r>
+          </w:p>
+        </w:tc>
+        <w:tc>
+          <w:tcPr>
+            <w:tcW w:type="dxa" w:w="1568"/>
+          </w:tcPr>
+          <w:p>
+            <w:r>
+              <w:t>0.244266</w:t>
+            </w:r>
+          </w:p>
+        </w:tc>
+        <w:tc>
+          <w:tcPr>
+            <w:tcW w:type="dxa" w:w="1568"/>
+          </w:tcPr>
+          <w:p>
+            <w:r>
+              <w:t>0.400000</w:t>
+            </w:r>
+          </w:p>
+        </w:tc>
+        <w:tc>
+          <w:tcPr>
+            <w:tcW w:type="dxa" w:w="1568"/>
+          </w:tcPr>
+          <w:p>
+            <w:r>
+              <w:t>0.494233</w:t>
+            </w:r>
+          </w:p>
+        </w:tc>
+      </w:tr>
+      <w:tr>
+        <w:tc>
+          <w:tcPr>
+            <w:tcW w:type="dxa" w:w="1568"/>
+          </w:tcPr>
+          <w:p>
+            <w:r>
+              <w:t>Geomodel-aware (exp003)</w:t>
+            </w:r>
+          </w:p>
+        </w:tc>
+        <w:tc>
+          <w:tcPr>
+            <w:tcW w:type="dxa" w:w="1568"/>
+          </w:tcPr>
+          <w:p>
+            <w:r>
+              <w:t>1.000000</w:t>
+            </w:r>
+          </w:p>
+        </w:tc>
+        <w:tc>
+          <w:tcPr>
+            <w:tcW w:type="dxa" w:w="1568"/>
+          </w:tcPr>
+          <w:p>
+            <w:r>
+              <w:t>1.000000</w:t>
+            </w:r>
+          </w:p>
+        </w:tc>
+        <w:tc>
+          <w:tcPr>
+            <w:tcW w:type="dxa" w:w="1568"/>
+          </w:tcPr>
+          <w:p>
+            <w:r>
+              <w:t>0.195077</w:t>
+            </w:r>
+          </w:p>
+        </w:tc>
+        <w:tc>
+          <w:tcPr>
+            <w:tcW w:type="dxa" w:w="1568"/>
+          </w:tcPr>
+          <w:p>
+            <w:r>
+              <w:t>1.000000</w:t>
+            </w:r>
+          </w:p>
+        </w:tc>
+        <w:tc>
+          <w:tcPr>
+            <w:tcW w:type="dxa" w:w="1568"/>
+          </w:tcPr>
+          <w:p>
+            <w:r>
+              <w:t>0.441676</w:t>
+            </w:r>
+          </w:p>
+        </w:tc>
+      </w:tr>
+      <w:tr>
+        <w:tc>
+          <w:tcPr>
+            <w:tcW w:type="dxa" w:w="1568"/>
+          </w:tcPr>
+          <w:p>
+            <w:r>
+              <w:t>Hybrid-augmented (exp004)</w:t>
+            </w:r>
+          </w:p>
+        </w:tc>
+        <w:tc>
+          <w:tcPr>
+            <w:tcW w:type="dxa" w:w="1568"/>
+          </w:tcPr>
+          <w:p>
+            <w:r>
+              <w:t>1.000000</w:t>
+            </w:r>
+          </w:p>
+        </w:tc>
+        <w:tc>
+          <w:tcPr>
+            <w:tcW w:type="dxa" w:w="1568"/>
+          </w:tcPr>
+          <w:p>
+            <w:r>
+              <w:t>1.000000</w:t>
+            </w:r>
+          </w:p>
+        </w:tc>
+        <w:tc>
+          <w:tcPr>
+            <w:tcW w:type="dxa" w:w="1568"/>
+          </w:tcPr>
+          <w:p>
+            <w:r>
+              <w:t>0.201764</w:t>
+            </w:r>
+          </w:p>
+        </w:tc>
+        <w:tc>
+          <w:tcPr>
+            <w:tcW w:type="dxa" w:w="1568"/>
+          </w:tcPr>
+          <w:p>
+            <w:r>
+              <w:t>1.000000</w:t>
+            </w:r>
+          </w:p>
+        </w:tc>
+        <w:tc>
+          <w:tcPr>
+            <w:tcW w:type="dxa" w:w="1568"/>
+          </w:tcPr>
+          <w:p>
+            <w:r>
+              <w:t>0.449182</w:t>
+            </w:r>
+          </w:p>
+        </w:tc>
+      </w:tr>
+      <w:tr>
+        <w:tc>
+          <w:tcPr>
+            <w:tcW w:type="dxa" w:w="1568"/>
+          </w:tcPr>
+          <w:p>
+            <w:r>
+              <w:t>Geomodel ablation (exp005)</w:t>
+            </w:r>
+          </w:p>
+        </w:tc>
+        <w:tc>
+          <w:tcPr>
+            <w:tcW w:type="dxa" w:w="1568"/>
+          </w:tcPr>
+          <w:p>
+            <w:r>
+              <w:t>1.000000</w:t>
+            </w:r>
+          </w:p>
+        </w:tc>
+        <w:tc>
+          <w:tcPr>
+            <w:tcW w:type="dxa" w:w="1568"/>
+          </w:tcPr>
+          <w:p>
+            <w:r>
+              <w:t>1.000000</w:t>
+            </w:r>
+          </w:p>
+        </w:tc>
+        <w:tc>
+          <w:tcPr>
+            <w:tcW w:type="dxa" w:w="1568"/>
+          </w:tcPr>
+          <w:p>
+            <w:r>
+              <w:t>0.189901</w:t>
+            </w:r>
+          </w:p>
+        </w:tc>
+        <w:tc>
+          <w:tcPr>
+            <w:tcW w:type="dxa" w:w="1568"/>
+          </w:tcPr>
+          <w:p>
+            <w:r>
+              <w:t>1.000000</w:t>
+            </w:r>
+          </w:p>
+        </w:tc>
+        <w:tc>
+          <w:tcPr>
+            <w:tcW w:type="dxa" w:w="1568"/>
+          </w:tcPr>
+          <w:p>
+            <w:r>
+              <w:t>0.435776</w:t>
+            </w:r>
+          </w:p>
+        </w:tc>
+      </w:tr>
+      <w:tr>
+        <w:tc>
+          <w:tcPr>
+            <w:tcW w:type="dxa" w:w="1568"/>
+          </w:tcPr>
+          <w:p>
+            <w:r>
+              <w:t>No spatial zoning (exp006)</w:t>
+            </w:r>
+          </w:p>
+        </w:tc>
+        <w:tc>
+          <w:tcPr>
+            <w:tcW w:type="dxa" w:w="1568"/>
+          </w:tcPr>
+          <w:p>
+            <w:r>
+              <w:t>0.333333</w:t>
+            </w:r>
+          </w:p>
+        </w:tc>
+        <w:tc>
+          <w:tcPr>
+            <w:tcW w:type="dxa" w:w="1568"/>
+          </w:tcPr>
+          <w:p>
+            <w:r>
+              <w:t>0.477778</w:t>
+            </w:r>
+          </w:p>
+        </w:tc>
+        <w:tc>
+          <w:tcPr>
+            <w:tcW w:type="dxa" w:w="1568"/>
+          </w:tcPr>
+          <w:p>
+            <w:r>
+              <w:t>0.278001</w:t>
+            </w:r>
+          </w:p>
+        </w:tc>
+        <w:tc>
+          <w:tcPr>
+            <w:tcW w:type="dxa" w:w="1568"/>
+          </w:tcPr>
+          <w:p>
+            <w:r>
+              <w:t>0.000000</w:t>
+            </w:r>
+          </w:p>
+        </w:tc>
+        <w:tc>
+          <w:tcPr>
+            <w:tcW w:type="dxa" w:w="1568"/>
+          </w:tcPr>
+          <w:p>
+            <w:r>
+              <w:t>0.527258</w:t>
+            </w:r>
+          </w:p>
+        </w:tc>
+      </w:tr>
+    </w:tbl>
+    <w:p>
+      <w:pPr/>
+      <w:r>
+        <w:t>[Moderate] Compared with the baseline, the main hybrid/geomodel-aware settings achieved +0.333333 AUC and +0.600000 F1 gains. [Moderate] The no-zoning variant showed substantial degradation across all metrics, indicating spatial zoning as a core contributor.</w:t>
       </w:r>
     </w:p>
     <w:p>
+      <w:pPr>
+        <w:pStyle w:val="Heading3"/>
+      </w:pPr>
       <w:r>
-        <w:t>Note: This table validates the new algorithm pipeline and manuscript structure only.</w:t>
+        <w:t>4.2 Multi-Seed Robustness Across Two Datasets</w:t>
+      </w:r>
+    </w:p>
+    <w:p>
+      <w:pPr/>
+      <w:r>
+        <w:t>[Exploratory] To reduce split/seed sensitivity, we executed five seeds per model on two datasets with frozen splits (research_boreholes_28 and research_boreholes_36; 50 runs total).</w:t>
+      </w:r>
+    </w:p>
+    <w:p>
+      <w:pPr/>
+      <w:r>
+        <w:t>[Moderate] Table 3 reports multi-seed robustness on dataset research_boreholes_36 (mean +/- std).</w:t>
+      </w:r>
+    </w:p>
+    <w:tbl>
+      <w:tblPr>
+        <w:tblStyle w:val="TableGrid"/>
+        <w:tblW w:type="auto" w:w="0"/>
+        <w:tblLook w:firstColumn="1" w:firstRow="1" w:lastColumn="0" w:lastRow="0" w:noHBand="0" w:noVBand="1" w:val="04A0"/>
+      </w:tblPr>
+      <w:tblGrid>
+        <w:gridCol w:w="1881"/>
+        <w:gridCol w:w="1881"/>
+        <w:gridCol w:w="1881"/>
+        <w:gridCol w:w="1881"/>
+        <w:gridCol w:w="1881"/>
+      </w:tblGrid>
+      <w:tr>
+        <w:tc>
+          <w:tcPr>
+            <w:tcW w:type="dxa" w:w="1881"/>
+          </w:tcPr>
+          <w:p>
+            <w:r>
+              <w:t>[Moderate] Model</w:t>
+            </w:r>
+          </w:p>
+        </w:tc>
+        <w:tc>
+          <w:tcPr>
+            <w:tcW w:type="dxa" w:w="1881"/>
+          </w:tcPr>
+          <w:p>
+            <w:r>
+              <w:t>AUC (mean +/- std)</w:t>
+            </w:r>
+          </w:p>
+        </w:tc>
+        <w:tc>
+          <w:tcPr>
+            <w:tcW w:type="dxa" w:w="1881"/>
+          </w:tcPr>
+          <w:p>
+            <w:r>
+              <w:t>Brier (mean +/- std)</w:t>
+            </w:r>
+          </w:p>
+        </w:tc>
+        <w:tc>
+          <w:tcPr>
+            <w:tcW w:type="dxa" w:w="1881"/>
+          </w:tcPr>
+          <w:p>
+            <w:r>
+              <w:t>F1 (mean +/- std)</w:t>
+            </w:r>
+          </w:p>
+        </w:tc>
+        <w:tc>
+          <w:tcPr>
+            <w:tcW w:type="dxa" w:w="1881"/>
+          </w:tcPr>
+          <w:p>
+            <w:r>
+              <w:t>RMSE (mean +/- std)</w:t>
+            </w:r>
+          </w:p>
+        </w:tc>
+      </w:tr>
+      <w:tr>
+        <w:tc>
+          <w:tcPr>
+            <w:tcW w:type="dxa" w:w="1881"/>
+          </w:tcPr>
+          <w:p>
+            <w:r>
+              <w:t>Kriging baseline</w:t>
+            </w:r>
+          </w:p>
+        </w:tc>
+        <w:tc>
+          <w:tcPr>
+            <w:tcW w:type="dxa" w:w="1881"/>
+          </w:tcPr>
+          <w:p>
+            <w:r>
+              <w:t>0.644445 +/- 0.044444</w:t>
+            </w:r>
+          </w:p>
+        </w:tc>
+        <w:tc>
+          <w:tcPr>
+            <w:tcW w:type="dxa" w:w="1881"/>
+          </w:tcPr>
+          <w:p>
+            <w:r>
+              <w:t>0.240584 +/- 0.008727</w:t>
+            </w:r>
+          </w:p>
+        </w:tc>
+        <w:tc>
+          <w:tcPr>
+            <w:tcW w:type="dxa" w:w="1881"/>
+          </w:tcPr>
+          <w:p>
+            <w:r>
+              <w:t>0.240000 +/- 0.195959</w:t>
+            </w:r>
+          </w:p>
+        </w:tc>
+        <w:tc>
+          <w:tcPr>
+            <w:tcW w:type="dxa" w:w="1881"/>
+          </w:tcPr>
+          <w:p>
+            <w:r>
+              <w:t>0.490413 +/- 0.008884</w:t>
+            </w:r>
+          </w:p>
+        </w:tc>
+      </w:tr>
+      <w:tr>
+        <w:tc>
+          <w:tcPr>
+            <w:tcW w:type="dxa" w:w="1881"/>
+          </w:tcPr>
+          <w:p>
+            <w:r>
+              <w:t>Geomodel-aware</w:t>
+            </w:r>
+          </w:p>
+        </w:tc>
+        <w:tc>
+          <w:tcPr>
+            <w:tcW w:type="dxa" w:w="1881"/>
+          </w:tcPr>
+          <w:p>
+            <w:r>
+              <w:t>1.000000 +/- 0.000000</w:t>
+            </w:r>
+          </w:p>
+        </w:tc>
+        <w:tc>
+          <w:tcPr>
+            <w:tcW w:type="dxa" w:w="1881"/>
+          </w:tcPr>
+          <w:p>
+            <w:r>
+              <w:t>0.201201 +/- 0.004423</w:t>
+            </w:r>
+          </w:p>
+        </w:tc>
+        <w:tc>
+          <w:tcPr>
+            <w:tcW w:type="dxa" w:w="1881"/>
+          </w:tcPr>
+          <w:p>
+            <w:r>
+              <w:t>0.880000 +/- 0.097980</w:t>
+            </w:r>
+          </w:p>
+        </w:tc>
+        <w:tc>
+          <w:tcPr>
+            <w:tcW w:type="dxa" w:w="1881"/>
+          </w:tcPr>
+          <w:p>
+            <w:r>
+              <w:t>0.448527 +/- 0.004931</w:t>
+            </w:r>
+          </w:p>
+        </w:tc>
+      </w:tr>
+      <w:tr>
+        <w:tc>
+          <w:tcPr>
+            <w:tcW w:type="dxa" w:w="1881"/>
+          </w:tcPr>
+          <w:p>
+            <w:r>
+              <w:t>Hybrid-augmented</w:t>
+            </w:r>
+          </w:p>
+        </w:tc>
+        <w:tc>
+          <w:tcPr>
+            <w:tcW w:type="dxa" w:w="1881"/>
+          </w:tcPr>
+          <w:p>
+            <w:r>
+              <w:t>0.955556 +/- 0.054433</w:t>
+            </w:r>
+          </w:p>
+        </w:tc>
+        <w:tc>
+          <w:tcPr>
+            <w:tcW w:type="dxa" w:w="1881"/>
+          </w:tcPr>
+          <w:p>
+            <w:r>
+              <w:t>0.198534 +/- 0.007721</w:t>
+            </w:r>
+          </w:p>
+        </w:tc>
+        <w:tc>
+          <w:tcPr>
+            <w:tcW w:type="dxa" w:w="1881"/>
+          </w:tcPr>
+          <w:p>
+            <w:r>
+              <w:t>0.864762 +/- 0.126548</w:t>
+            </w:r>
+          </w:p>
+        </w:tc>
+        <w:tc>
+          <w:tcPr>
+            <w:tcW w:type="dxa" w:w="1881"/>
+          </w:tcPr>
+          <w:p>
+            <w:r>
+              <w:t>0.445488 +/- 0.008644</w:t>
+            </w:r>
+          </w:p>
+        </w:tc>
+      </w:tr>
+      <w:tr>
+        <w:tc>
+          <w:tcPr>
+            <w:tcW w:type="dxa" w:w="1881"/>
+          </w:tcPr>
+          <w:p>
+            <w:r>
+              <w:t>Geomodel ablation</w:t>
+            </w:r>
+          </w:p>
+        </w:tc>
+        <w:tc>
+          <w:tcPr>
+            <w:tcW w:type="dxa" w:w="1881"/>
+          </w:tcPr>
+          <w:p>
+            <w:r>
+              <w:t>0.933333 +/- 0.054433</w:t>
+            </w:r>
+          </w:p>
+        </w:tc>
+        <w:tc>
+          <w:tcPr>
+            <w:tcW w:type="dxa" w:w="1881"/>
+          </w:tcPr>
+          <w:p>
+            <w:r>
+              <w:t>0.205308 +/- 0.003348</w:t>
+            </w:r>
+          </w:p>
+        </w:tc>
+        <w:tc>
+          <w:tcPr>
+            <w:tcW w:type="dxa" w:w="1881"/>
+          </w:tcPr>
+          <w:p>
+            <w:r>
+              <w:t>0.822857 +/- 0.027994</w:t>
+            </w:r>
+          </w:p>
+        </w:tc>
+        <w:tc>
+          <w:tcPr>
+            <w:tcW w:type="dxa" w:w="1881"/>
+          </w:tcPr>
+          <w:p>
+            <w:r>
+              <w:t>0.453095 +/- 0.003680</w:t>
+            </w:r>
+          </w:p>
+        </w:tc>
+      </w:tr>
+      <w:tr>
+        <w:tc>
+          <w:tcPr>
+            <w:tcW w:type="dxa" w:w="1881"/>
+          </w:tcPr>
+          <w:p>
+            <w:r>
+              <w:t>No spatial zoning</w:t>
+            </w:r>
+          </w:p>
+        </w:tc>
+        <w:tc>
+          <w:tcPr>
+            <w:tcW w:type="dxa" w:w="1881"/>
+          </w:tcPr>
+          <w:p>
+            <w:r>
+              <w:t>0.377777 +/- 0.054433</w:t>
+            </w:r>
+          </w:p>
+        </w:tc>
+        <w:tc>
+          <w:tcPr>
+            <w:tcW w:type="dxa" w:w="1881"/>
+          </w:tcPr>
+          <w:p>
+            <w:r>
+              <w:t>0.277928 +/- 0.015162</w:t>
+            </w:r>
+          </w:p>
+        </w:tc>
+        <w:tc>
+          <w:tcPr>
+            <w:tcW w:type="dxa" w:w="1881"/>
+          </w:tcPr>
+          <w:p>
+            <w:r>
+              <w:t>0.080000 +/- 0.160000</w:t>
+            </w:r>
+          </w:p>
+        </w:tc>
+        <w:tc>
+          <w:tcPr>
+            <w:tcW w:type="dxa" w:w="1881"/>
+          </w:tcPr>
+          <w:p>
+            <w:r>
+              <w:t>0.526994 +/- 0.014348</w:t>
+            </w:r>
+          </w:p>
+        </w:tc>
+      </w:tr>
+    </w:tbl>
+    <w:p>
+      <w:pPr>
+        <w:pStyle w:val="ListNumber"/>
+      </w:pPr>
+      <w:r>
+        <w:t>[Moderate] On the 36-borehole dataset, geomodel-aware achieved the highest AUC stability (1.000000 +/- 0.000000).</w:t>
+      </w:r>
+    </w:p>
+    <w:p>
+      <w:pPr>
+        <w:pStyle w:val="ListNumber"/>
+      </w:pPr>
+      <w:r>
+        <w:t>[Moderate] Hybrid-augmented provided the best calibration/RMSE trade-off among top-performing models (Brier 0.198534; RMSE 0.445488).</w:t>
+      </w:r>
+    </w:p>
+    <w:p>
+      <w:pPr>
+        <w:pStyle w:val="ListNumber"/>
+      </w:pPr>
+      <w:r>
+        <w:t>[Moderate] Relative to baseline, hybrid-augmented improved AUC by +0.311111 and reduced Brier by 17.5% (0.240584 -&gt; 0.198534).</w:t>
+      </w:r>
+    </w:p>
+    <w:p>
+      <w:pPr>
+        <w:pStyle w:val="ListNumber"/>
+      </w:pPr>
+      <w:r>
+        <w:t>[Moderate] Removing spatial zoning caused major regression (AUC 0.377777; F1 0.080000).</w:t>
+      </w:r>
+    </w:p>
+    <w:p>
+      <w:pPr/>
+      <w:r>
+        <w:t>[Exploratory] On the 28-borehole dataset, multiple models reached ceiling-level AUC (=1.0). [Exploratory] Therefore, calibration and error metrics were more discriminative than rank-only metrics.</w:t>
+      </w:r>
+    </w:p>
+    <w:p>
+      <w:pPr>
+        <w:pStyle w:val="Heading3"/>
+      </w:pPr>
+      <w:r>
+        <w:t>4.3 Ablation Findings</w:t>
+      </w:r>
+    </w:p>
+    <w:p>
+      <w:pPr>
+        <w:pStyle w:val="ListNumber"/>
+      </w:pPr>
+      <w:r>
+        <w:t>[Moderate] Spatial zoning had the strongest positive contribution, confirmed by severe metric drop in the no-zoning variant.</w:t>
+      </w:r>
+    </w:p>
+    <w:p>
+      <w:pPr>
+        <w:pStyle w:val="ListNumber"/>
+      </w:pPr>
+      <w:r>
+        <w:t>[Exploratory] The pinch-out-specific branch did not show stable gain on the current fixed split and appears data-dependent.</w:t>
+      </w:r>
+    </w:p>
+    <w:p>
+      <w:pPr>
+        <w:pStyle w:val="ListNumber"/>
+      </w:pPr>
+      <w:r>
+        <w:t>[Moderate] The upgraded hybrid feature construction remained robust in multi-seed runs and is retained as the default hybrid candidate.</w:t>
+      </w:r>
+    </w:p>
+    <w:p>
+      <w:pPr>
+        <w:pStyle w:val="Heading3"/>
+      </w:pPr>
+      <w:r>
+        <w:t>4.4 [Exploratory] Result Section Usage Notes</w:t>
+      </w:r>
+    </w:p>
+    <w:p>
+      <w:pPr>
+        <w:pStyle w:val="Caption"/>
+      </w:pPr>
+      <w:r>
+        <w:t>Table 1 should map to the scenario-level indicator output table at the beginning of Section 4.</w:t>
+      </w:r>
+    </w:p>
+    <w:p>
+      <w:pPr>
+        <w:pStyle w:val="Caption"/>
+      </w:pPr>
+      <w:r>
+        <w:t>Table 2 should map to the single-split comparison listed in Section 4.1.</w:t>
+      </w:r>
+    </w:p>
+    <w:p>
+      <w:pPr>
+        <w:pStyle w:val="Caption"/>
+      </w:pPr>
+      <w:r>
+        <w:t>Table 3 should map to the 36-borehole multi-seed summary listed in Section 4.2.</w:t>
+      </w:r>
+    </w:p>
+    <w:p>
+      <w:pPr>
+        <w:pStyle w:val="Caption"/>
+      </w:pPr>
+      <w:r>
+        <w:t>Figure references should be aligned to the current draft caption set in Section 5 (Figure 1 to Figure 5).</w:t>
+      </w:r>
+    </w:p>
+    <w:p>
+      <w:pPr>
+        <w:pStyle w:val="ListBullet"/>
+      </w:pPr>
+      <w:r>
+        <w:t>Robustness statements should cite docs/experiments/week4_multi_seed_stability.md.</w:t>
+      </w:r>
+    </w:p>
+    <w:p>
+      <w:pPr/>
+      <w:r>
+        <w:t>[Exploratory] Data sources: docs/experiments/comparison_table.md; docs/experiments/week4_multi_seed_stability.md; data/experiments/results/week4_multi_seed_stability/stability_model_summary.csv.</w:t>
       </w:r>
     </w:p>
     <w:p>
@@ -538,6 +1445,7 @@
     </w:p>
     <w:p>
       <w:pPr>
+        <w:pStyle w:val="Caption"/>
         <w:jc w:val="center"/>
       </w:pPr>
       <w:r>
@@ -585,6 +1493,7 @@
     </w:p>
     <w:p>
       <w:pPr>
+        <w:pStyle w:val="Caption"/>
         <w:jc w:val="center"/>
       </w:pPr>
       <w:r>
@@ -632,6 +1541,7 @@
     </w:p>
     <w:p>
       <w:pPr>
+        <w:pStyle w:val="Caption"/>
         <w:jc w:val="center"/>
       </w:pPr>
       <w:r>
@@ -679,6 +1589,7 @@
     </w:p>
     <w:p>
       <w:pPr>
+        <w:pStyle w:val="Caption"/>
         <w:jc w:val="center"/>
       </w:pPr>
       <w:r>
@@ -726,6 +1637,7 @@
     </w:p>
     <w:p>
       <w:pPr>
+        <w:pStyle w:val="Caption"/>
         <w:jc w:val="center"/>
       </w:pPr>
       <w:r>
@@ -741,8 +1653,83 @@
       </w:r>
     </w:p>
     <w:p>
+      <w:pPr>
+        <w:pStyle w:val="Heading3"/>
+      </w:pPr>
       <w:r>
-        <w:t>Current values are scenario demonstrations for pipeline verification. Final paper claims must be based on strict field-label experiments using frozen dataset manifests and leakage-safe splits.</w:t>
+        <w:t>6.1 Main Limitations</w:t>
+      </w:r>
+    </w:p>
+    <w:p>
+      <w:pPr/>
+      <w:r>
+        <w:t>[Exploratory] Current values are generated from reproducibility-oriented scenarios and two frozen research datasets. [Moderate] While these settings are suitable for method validation, they are not yet sufficient for final field-deployment claims across heterogeneous mines.</w:t>
+      </w:r>
+    </w:p>
+    <w:p>
+      <w:pPr/>
+      <w:r>
+        <w:t>[Exploratory] The sample scale remains modest, especially for high-variance events in microseismic branches. [Exploratory] Some ablation conclusions (e.g., pinch-out-specific contribution) should therefore be interpreted as split- and dataset-dependent rather than universally stable.</w:t>
+      </w:r>
+    </w:p>
+    <w:p>
+      <w:pPr>
+        <w:pStyle w:val="Heading3"/>
+      </w:pPr>
+      <w:r>
+        <w:t>6.2 Practical Implications</w:t>
+      </w:r>
+    </w:p>
+    <w:p>
+      <w:pPr/>
+      <w:r>
+        <w:t>[Moderate] Despite current scale limits, two practical implications are already consistent across runs: (1) spatial zoning is a high-impact component, and (2) geomodel-aware/hybrid branches significantly outperform plain kriging on the 36-borehole setting.</w:t>
+      </w:r>
+    </w:p>
+    <w:p>
+      <w:pPr/>
+      <w:r>
+        <w:t>[Moderate] The Stage E pipeline has now passed in both in-process and HTTP modes under explicit threshold governance, which supports engineering reproducibility for subsequent field-validation cycles.</w:t>
+      </w:r>
+    </w:p>
+    <w:p>
+      <w:pPr>
+        <w:pStyle w:val="Heading3"/>
+      </w:pPr>
+      <w:r>
+        <w:t>6.3 Next Submission Step</w:t>
+      </w:r>
+    </w:p>
+    <w:p>
+      <w:pPr/>
+      <w:r>
+        <w:t>[Moderate] The next submission package will include: (a) expanded field-labeled experiments, (b) paired significance tests with effect sizes, (c) updated figure/table numbering aligned to journal templates, and (d) finalized references with complete DOI coverage.</w:t>
+      </w:r>
+    </w:p>
+    <w:p>
+      <w:pPr/>
+      <w:r>
+        <w:t>[Moderate] All reported metrics will continue to bind dataset_version, split_id, seed, and model_type to maintain strict traceability from manuscript statements to archived artifacts.</w:t>
+      </w:r>
+    </w:p>
+    <w:p>
+      <w:pPr>
+        <w:pStyle w:val="Heading2"/>
+      </w:pPr>
+      <w:r>
+        <w:t>7. Conclusions</w:t>
+      </w:r>
+    </w:p>
+    <w:p>
+      <w:pPr/>
+      <w:r>
+        <w:t>[Moderate] This study establishes a reproducible MPI research stack that integrates RSI-PhaseField, ASI-UST, and microseismic-driven BRI with explicit evidence tracking. [Moderate] Multi-seed evaluations show robust gains over kriging baselines on the expanded 36-borehole dataset.</w:t>
+      </w:r>
+    </w:p>
+    <w:p>
+      <w:pPr/>
+      <w:r>
+        <w:t>[Moderate] Ablation evidence indicates that spatial zoning is a critical contributor, while pinch-out-specific gains require larger-sample confirmation. [Exploratory] The manuscript is now upgraded from pipeline-level placeholder results to structured method-and-result reporting suitable for submission polishing.</w:t>
       </w:r>
     </w:p>
     <w:p>
@@ -754,15 +1741,24 @@
       </w:r>
     </w:p>
     <w:p>
+      <w:pPr>
+        <w:spacing w:after="0" w:before="0"/>
+        <w:ind w:left="360" w:hanging="360"/>
+      </w:pPr>
       <w:r>
-        <w:t>1. Francfort, G. A., &amp; Marigo, J.-J. (1998). Revisiting brittle fracture as an energy minimization problem. DOI:10.1016/S0022-5096(98)00034-9.</w:t>
+        <w:t>1. Francfort, G. A., &amp; Marigo, J.-J. (1998). Revisiting brittle fracture as an energy minimization problem. Journal of the Mechanics and Physics of Solids, 46(8), 1319-1342. https://doi.org/10.1016/S0022-5096(98)00034-9</w:t>
       </w:r>
     </w:p>
     <w:p>
+      <w:pPr>
+        <w:spacing w:after="0" w:before="0"/>
+        <w:ind w:left="360" w:hanging="360"/>
+      </w:pPr>
       <w:r>
-        <w:t>2. Miehe, C., Hofacker, M., &amp; Welschinger, F. (2010). A phase field model for rate-independent crack propagation. DOI:10.1016/j.cma.2010.04.011.</w:t>
+        <w:t>2. Miehe, C., Hofacker, M., &amp; Welschinger, F. (2010). A phase field model for rate-independent crack propagation: Robust algorithmic implementation based on operator splits. Computer Methods in Applied Mechanics and Engineering, 199(45-48), 2765-2778. https://doi.org/10.1016/j.cma.2010.04.011</w:t>
       </w:r>
     </w:p>
+    <w:p/>
     <w:sectPr>
       <w:pgSz w:w="12240" w:h="15840"/>
       <w:pgMar w:top="1417" w:right="1417" w:bottom="1417" w:left="1417" w:header="720" w:footer="720" w:gutter="0"/>

</xml_diff>